<commit_message>
final difficulty tier output
</commit_message>
<xml_diff>
--- a/docs/Additional Material/Journal.docx
+++ b/docs/Additional Material/Journal.docx
@@ -14280,7 +14280,86 @@
         <w:t xml:space="preserve">Now ill be running </w:t>
       </w:r>
       <w:r>
-        <w:t xml:space="preserve">annotate_tasks.py, applying the gold </w:t>
+        <w:t>annotate_tasks.py</w:t>
+      </w:r>
+      <w:r>
+        <w:t xml:space="preserve"> by “</w:t>
+      </w:r>
+      <w:r>
+        <w:t>python annotate_tasks.py --apply-gold ../../data/raw/</w:t>
+      </w:r>
+      <w:proofErr w:type="spellStart"/>
+      <w:r>
+        <w:t>annotation_tests</w:t>
+      </w:r>
+      <w:proofErr w:type="spellEnd"/>
+      <w:r>
+        <w:t>/run2/tasks_annotated_run2.jsonl --gold-labels ../../data/raw/</w:t>
+      </w:r>
+      <w:proofErr w:type="spellStart"/>
+      <w:r>
+        <w:t>annotation_tests</w:t>
+      </w:r>
+      <w:proofErr w:type="spellEnd"/>
+      <w:r>
+        <w:t>/run2/gold_set_50.jsonl --out ../../data/processed/final_annotation_difficulty_tiers/task_metadata.jsonl</w:t>
+      </w:r>
+      <w:r>
+        <w:t>”</w:t>
+      </w:r>
+      <w:r>
+        <w:t xml:space="preserve">. </w:t>
+      </w:r>
+    </w:p>
+    <w:p>
+      <w:r>
+        <w:t>--apply-gold takes the LLM annotators output for all 475 tasks and overwrites the 50 gold tasks with my own hand labels, since my labels are better than the models by definition</w:t>
+      </w:r>
+      <w:r>
+        <w:t xml:space="preserve">. </w:t>
+      </w:r>
+      <w:r>
+        <w:t xml:space="preserve">It recomputes </w:t>
+      </w:r>
+      <w:proofErr w:type="spellStart"/>
+      <w:r>
+        <w:t>rubric_total</w:t>
+      </w:r>
+      <w:proofErr w:type="spellEnd"/>
+      <w:r>
+        <w:t xml:space="preserve"> and </w:t>
+      </w:r>
+      <w:proofErr w:type="spellStart"/>
+      <w:r>
+        <w:t>difficulty_tier</w:t>
+      </w:r>
+      <w:proofErr w:type="spellEnd"/>
+      <w:r>
+        <w:t xml:space="preserve"> for those rows, stamps every row with </w:t>
+      </w:r>
+      <w:proofErr w:type="spellStart"/>
+      <w:r>
+        <w:t>label_source</w:t>
+      </w:r>
+      <w:proofErr w:type="spellEnd"/>
+      <w:r>
+        <w:t xml:space="preserve"> ("human" for the 50, "model" for the other 425) so the provenance is visible in the data itself, and writes the result to </w:t>
+      </w:r>
+      <w:proofErr w:type="spellStart"/>
+      <w:r>
+        <w:t>task_metadata.jsonl</w:t>
+      </w:r>
+      <w:proofErr w:type="spellEnd"/>
+      <w:r>
+        <w:t xml:space="preserve"> in the </w:t>
+      </w:r>
+      <w:proofErr w:type="spellStart"/>
+      <w:r>
+        <w:t>final_annotation_difficulty_tiers</w:t>
+      </w:r>
+      <w:proofErr w:type="spellEnd"/>
+      <w:r>
+        <w:t xml:space="preserve"> directory.</w:t>
       </w:r>
     </w:p>
     <w:sectPr>

</xml_diff>

<commit_message>
scheme plots and terminal output
</commit_message>
<xml_diff>
--- a/docs/Additional Material/Journal.docx
+++ b/docs/Additional Material/Journal.docx
@@ -23657,6 +23657,22 @@
       <w:proofErr w:type="spellEnd"/>
       <w:r>
         <w:t>.</w:t>
+      </w:r>
+    </w:p>
+    <w:p>
+      <w:pPr>
+        <w:tabs>
+          <w:tab w:val="left" w:pos="6520"/>
+        </w:tabs>
+      </w:pPr>
+      <w:r>
+        <w:t xml:space="preserve">Freeze </w:t>
+      </w:r>
+      <w:r>
+        <w:t xml:space="preserve">requirements </w:t>
+      </w:r>
+      <w:r>
+        <w:t xml:space="preserve">from environment and pull locally. </w:t>
       </w:r>
     </w:p>
     <w:sectPr>

</xml_diff>